<commit_message>
Restore CVE line on report cover
</commit_message>
<xml_diff>
--- a/docs/report/Work1-Report.docx
+++ b/docs/report/Work1-Report.docx
@@ -104,10 +104,10 @@
         <w:rPr>
           <w:b/>
         </w:rPr>
-        <w:t xml:space="preserve">Variant: </w:t>
+        <w:t xml:space="preserve">CVE: </w:t>
       </w:r>
       <w:r>
-        <w:t>______</w:t>
+        <w:t>CVE-2023-28432</w:t>
       </w:r>
     </w:p>
     <w:p>

</xml_diff>